<commit_message>
add in my flare
</commit_message>
<xml_diff>
--- a/Project_Proposal_Group129.docx
+++ b/Project_Proposal_Group129.docx
@@ -7,7 +7,7 @@
         <w:autoSpaceDE w:val="0"/>
         <w:autoSpaceDN w:val="0"/>
         <w:adjustRightInd w:val="0"/>
-        <w:jc w:val="center"/>
+        <w:jc w:val="both"/>
         <w:rPr>
           <w:rFonts w:ascii="Verdana" w:hAnsi="Verdana" w:cs="CMBX12"/>
           <w:sz w:val="22"/>
@@ -64,7 +64,7 @@
                         </a:ln>
                         <a:extLst>
                           <a:ext uri="{909E8E84-426E-40dd-AFC4-6F175D3DCCD1}">
-                            <a14:hiddenFill xmlns:a14="http://schemas.microsoft.com/office/drawing/2010/main" xmlns:w="http://schemas.openxmlformats.org/wordprocessingml/2006/main" xmlns:w10="urn:schemas-microsoft-com:office:word" xmlns:v="urn:schemas-microsoft-com:vml" xmlns:o="urn:schemas-microsoft-com:office:office" xmlns:mv="urn:schemas-microsoft-com:mac:vml" xmlns:mo="http://schemas.microsoft.com/office/mac/office/2008/main" xmlns="">
+                            <a14:hiddenFill xmlns="" xmlns:mo="http://schemas.microsoft.com/office/mac/office/2008/main" xmlns:mv="urn:schemas-microsoft-com:mac:vml" xmlns:o="urn:schemas-microsoft-com:office:office" xmlns:v="urn:schemas-microsoft-com:vml" xmlns:w10="urn:schemas-microsoft-com:office:word" xmlns:w="http://schemas.openxmlformats.org/wordprocessingml/2006/main" xmlns:a14="http://schemas.microsoft.com/office/drawing/2010/main">
                               <a:noFill/>
                             </a14:hiddenFill>
                           </a:ext>
@@ -85,7 +85,7 @@
           </mc:Choice>
           <mc:Fallback>
             <w:pict>
-              <v:line w14:anchorId="44FA0128" id="Line 2" o:spid="_x0000_s1026" style="position:absolute;z-index:251659264;visibility:visible;mso-wrap-style:square;mso-width-percent:0;mso-height-percent:0;mso-wrap-distance-left:9pt;mso-wrap-distance-top:0;mso-wrap-distance-right:9pt;mso-wrap-distance-bottom:0;mso-position-horizontal:absolute;mso-position-horizontal-relative:text;mso-position-vertical:absolute;mso-position-vertical-relative:text;mso-width-percent:0;mso-height-percent:0;mso-width-relative:page;mso-height-relative:page" from="0,9pt" to="540pt,9pt" o:gfxdata="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" strokeweight="2.25pt"/>
+              <v:line w14:anchorId="2FCA5380" id="Line 2" o:spid="_x0000_s1026" style="position:absolute;z-index:251659264;visibility:visible;mso-wrap-style:square;mso-width-percent:0;mso-height-percent:0;mso-wrap-distance-left:9pt;mso-wrap-distance-top:0;mso-wrap-distance-right:9pt;mso-wrap-distance-bottom:0;mso-position-horizontal:absolute;mso-position-horizontal-relative:text;mso-position-vertical:absolute;mso-position-vertical-relative:text;mso-width-percent:0;mso-height-percent:0;mso-width-relative:page;mso-height-relative:page" from="0,9pt" to="540pt,9pt" o:gfxdata="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" strokeweight="2.25pt"/>
             </w:pict>
           </mc:Fallback>
         </mc:AlternateContent>
@@ -219,7 +219,7 @@
         <w:autoSpaceDN w:val="0"/>
         <w:adjustRightInd w:val="0"/>
         <w:ind w:left="-360"/>
-        <w:jc w:val="center"/>
+        <w:jc w:val="both"/>
         <w:rPr>
           <w:rFonts w:ascii="Verdana" w:hAnsi="Verdana" w:cs="CMBX12~c"/>
           <w:sz w:val="22"/>
@@ -276,7 +276,7 @@
                         </a:ln>
                         <a:extLst>
                           <a:ext uri="{909E8E84-426E-40dd-AFC4-6F175D3DCCD1}">
-                            <a14:hiddenFill xmlns:a14="http://schemas.microsoft.com/office/drawing/2010/main" xmlns:w="http://schemas.openxmlformats.org/wordprocessingml/2006/main" xmlns:w10="urn:schemas-microsoft-com:office:word" xmlns:v="urn:schemas-microsoft-com:vml" xmlns:o="urn:schemas-microsoft-com:office:office" xmlns:mv="urn:schemas-microsoft-com:mac:vml" xmlns:mo="http://schemas.microsoft.com/office/mac/office/2008/main" xmlns="">
+                            <a14:hiddenFill xmlns="" xmlns:mo="http://schemas.microsoft.com/office/mac/office/2008/main" xmlns:mv="urn:schemas-microsoft-com:mac:vml" xmlns:o="urn:schemas-microsoft-com:office:office" xmlns:v="urn:schemas-microsoft-com:vml" xmlns:w10="urn:schemas-microsoft-com:office:word" xmlns:w="http://schemas.openxmlformats.org/wordprocessingml/2006/main" xmlns:a14="http://schemas.microsoft.com/office/drawing/2010/main">
                               <a:noFill/>
                             </a14:hiddenFill>
                           </a:ext>
@@ -297,7 +297,7 @@
           </mc:Choice>
           <mc:Fallback>
             <w:pict>
-              <v:line w14:anchorId="303BFD83" id="Line 3" o:spid="_x0000_s1026" style="position:absolute;z-index:251660288;visibility:visible;mso-wrap-style:square;mso-width-percent:0;mso-height-percent:0;mso-wrap-distance-left:9pt;mso-wrap-distance-top:0;mso-wrap-distance-right:9pt;mso-wrap-distance-bottom:0;mso-position-horizontal:absolute;mso-position-horizontal-relative:text;mso-position-vertical:absolute;mso-position-vertical-relative:text;mso-width-percent:0;mso-height-percent:0;mso-width-relative:page;mso-height-relative:page" from="1.05pt,7.15pt" to="541.05pt,7.15pt" o:gfxdata="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" strokeweight="2.25pt"/>
+              <v:line w14:anchorId="37B9F0E2" id="Line 3" o:spid="_x0000_s1026" style="position:absolute;z-index:251660288;visibility:visible;mso-wrap-style:square;mso-width-percent:0;mso-height-percent:0;mso-wrap-distance-left:9pt;mso-wrap-distance-top:0;mso-wrap-distance-right:9pt;mso-wrap-distance-bottom:0;mso-position-horizontal:absolute;mso-position-horizontal-relative:text;mso-position-vertical:absolute;mso-position-vertical-relative:text;mso-width-percent:0;mso-height-percent:0;mso-width-relative:page;mso-height-relative:page" from="1.05pt,7.15pt" to="541.05pt,7.15pt" o:gfxdata="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" strokeweight="2.25pt"/>
             </w:pict>
           </mc:Fallback>
         </mc:AlternateContent>
@@ -305,16 +305,17 @@
     </w:p>
     <w:p>
       <w:pPr>
-        <w:jc w:val="center"/>
-        <w:rPr>
-          <w:rFonts w:ascii="Verdana" w:hAnsi="Verdana"/>
-          <w:sz w:val="22"/>
-          <w:szCs w:val="22"/>
-        </w:rPr>
-      </w:pPr>
-    </w:p>
-    <w:p>
-      <w:pPr>
+        <w:jc w:val="both"/>
+        <w:rPr>
+          <w:rFonts w:ascii="Verdana" w:hAnsi="Verdana"/>
+          <w:sz w:val="22"/>
+          <w:szCs w:val="22"/>
+        </w:rPr>
+      </w:pPr>
+    </w:p>
+    <w:p>
+      <w:pPr>
+        <w:jc w:val="both"/>
         <w:rPr>
           <w:rFonts w:ascii="Verdana" w:hAnsi="Verdana"/>
           <w:sz w:val="22"/>
@@ -348,6 +349,7 @@
     </w:p>
     <w:p>
       <w:pPr>
+        <w:jc w:val="both"/>
         <w:rPr>
           <w:rFonts w:ascii="Verdana" w:hAnsi="Verdana"/>
           <w:sz w:val="22"/>
@@ -365,19 +367,114 @@
     </w:p>
     <w:p>
       <w:pPr>
-        <w:rPr>
-          <w:rFonts w:ascii="Verdana" w:hAnsi="Verdana"/>
-          <w:sz w:val="22"/>
-          <w:szCs w:val="22"/>
-        </w:rPr>
-      </w:pPr>
-      <w:r>
-        <w:rPr>
-          <w:rFonts w:ascii="Verdana" w:hAnsi="Verdana"/>
-          <w:sz w:val="22"/>
-          <w:szCs w:val="22"/>
-        </w:rPr>
-        <w:t xml:space="preserve">Ricky </w:t>
+        <w:jc w:val="both"/>
+        <w:rPr>
+          <w:rFonts w:ascii="Verdana" w:hAnsi="Verdana"/>
+          <w:sz w:val="22"/>
+          <w:szCs w:val="22"/>
+        </w:rPr>
+      </w:pPr>
+      <w:r>
+        <w:rPr>
+          <w:rFonts w:ascii="Verdana" w:hAnsi="Verdana"/>
+          <w:sz w:val="22"/>
+          <w:szCs w:val="22"/>
+        </w:rPr>
+        <w:t xml:space="preserve">Ricky Wiryopranoto (GT ID: </w:t>
+      </w:r>
+      <w:r>
+        <w:rPr>
+          <w:rFonts w:ascii="Verdana" w:hAnsi="Verdana"/>
+          <w:sz w:val="22"/>
+          <w:szCs w:val="22"/>
+        </w:rPr>
+        <w:t>903949033</w:t>
+      </w:r>
+      <w:r>
+        <w:rPr>
+          <w:rFonts w:ascii="Verdana" w:hAnsi="Verdana"/>
+          <w:sz w:val="22"/>
+          <w:szCs w:val="22"/>
+        </w:rPr>
+        <w:t>)</w:t>
+      </w:r>
+    </w:p>
+    <w:p>
+      <w:pPr>
+        <w:jc w:val="both"/>
+        <w:rPr>
+          <w:rFonts w:ascii="Verdana" w:hAnsi="Verdana"/>
+          <w:sz w:val="22"/>
+          <w:szCs w:val="22"/>
+        </w:rPr>
+      </w:pPr>
+      <w:r>
+        <w:rPr>
+          <w:rFonts w:ascii="Verdana" w:hAnsi="Verdana"/>
+          <w:sz w:val="22"/>
+          <w:szCs w:val="22"/>
+        </w:rPr>
+        <w:t>Ram Charan Singh (GT ID: 903860201)</w:t>
+      </w:r>
+    </w:p>
+    <w:p>
+      <w:pPr>
+        <w:jc w:val="both"/>
+        <w:rPr>
+          <w:rFonts w:ascii="Verdana" w:hAnsi="Verdana"/>
+          <w:sz w:val="22"/>
+          <w:szCs w:val="22"/>
+        </w:rPr>
+      </w:pPr>
+    </w:p>
+    <w:p>
+      <w:pPr>
+        <w:jc w:val="both"/>
+        <w:rPr>
+          <w:rFonts w:ascii="Verdana" w:hAnsi="Verdana"/>
+          <w:sz w:val="22"/>
+          <w:szCs w:val="22"/>
+        </w:rPr>
+      </w:pPr>
+      <w:r>
+        <w:rPr>
+          <w:rFonts w:ascii="Verdana" w:hAnsi="Verdana"/>
+          <w:sz w:val="22"/>
+          <w:szCs w:val="22"/>
+        </w:rPr>
+        <w:t xml:space="preserve">Project </w:t>
+      </w:r>
+      <w:r>
+        <w:rPr>
+          <w:rFonts w:ascii="Verdana" w:hAnsi="Verdana"/>
+          <w:sz w:val="22"/>
+          <w:szCs w:val="22"/>
+        </w:rPr>
+        <w:t>Title:</w:t>
+      </w:r>
+      <w:r>
+        <w:rPr>
+          <w:rFonts w:ascii="Verdana" w:hAnsi="Verdana"/>
+          <w:sz w:val="22"/>
+          <w:szCs w:val="22"/>
+        </w:rPr>
+        <w:t xml:space="preserve"> </w:t>
+      </w:r>
+      <w:r>
+        <w:rPr>
+          <w:rFonts w:ascii="Verdana" w:hAnsi="Verdana"/>
+          <w:sz w:val="22"/>
+          <w:szCs w:val="22"/>
+        </w:rPr>
+        <w:t>Beyond</w:t>
+      </w:r>
+      <w:r>
+        <w:rPr>
+          <w:rFonts w:ascii="Verdana" w:hAnsi="Verdana"/>
+          <w:sz w:val="22"/>
+          <w:szCs w:val="22"/>
+        </w:rPr>
+        <w:t xml:space="preserve"> the </w:t>
       </w:r>
       <w:proofErr w:type="spellStart"/>
       <w:r>
@@ -385,8 +482,18 @@
           <w:rFonts w:ascii="Verdana" w:hAnsi="Verdana"/>
           <w:sz w:val="22"/>
           <w:szCs w:val="22"/>
-        </w:rPr>
-        <w:t>Wiryopranoto</w:t>
+          <w:lang w:val="en-SG"/>
+        </w:rPr>
+        <w:t>Poké</w:t>
+      </w:r>
+      <w:r>
+        <w:rPr>
+          <w:rFonts w:ascii="Verdana" w:hAnsi="Verdana"/>
+          <w:sz w:val="22"/>
+          <w:szCs w:val="22"/>
+          <w:lang w:val="en-SG"/>
+        </w:rPr>
+        <w:t>dex</w:t>
       </w:r>
       <w:proofErr w:type="spellEnd"/>
       <w:r>
@@ -395,96 +502,12 @@
           <w:sz w:val="22"/>
           <w:szCs w:val="22"/>
         </w:rPr>
-        <w:t xml:space="preserve"> (GT ID: </w:t>
-      </w:r>
-      <w:r>
-        <w:rPr>
-          <w:rFonts w:ascii="Verdana" w:hAnsi="Verdana"/>
-          <w:sz w:val="22"/>
-          <w:szCs w:val="22"/>
-          <w:highlight w:val="yellow"/>
-        </w:rPr>
-        <w:t>blah blah</w:t>
-      </w:r>
-      <w:r>
-        <w:rPr>
-          <w:rFonts w:ascii="Verdana" w:hAnsi="Verdana"/>
-          <w:sz w:val="22"/>
-          <w:szCs w:val="22"/>
-        </w:rPr>
-        <w:t>)</w:t>
-      </w:r>
-    </w:p>
-    <w:p>
-      <w:pPr>
-        <w:rPr>
-          <w:rFonts w:ascii="Verdana" w:hAnsi="Verdana"/>
-          <w:sz w:val="22"/>
-          <w:szCs w:val="22"/>
-        </w:rPr>
-      </w:pPr>
-      <w:r>
-        <w:rPr>
-          <w:rFonts w:ascii="Verdana" w:hAnsi="Verdana"/>
-          <w:sz w:val="22"/>
-          <w:szCs w:val="22"/>
-        </w:rPr>
-        <w:t>Ram Charan Singh (GT ID: 903860201)</w:t>
-      </w:r>
-    </w:p>
-    <w:p>
-      <w:pPr>
-        <w:rPr>
-          <w:rFonts w:ascii="Verdana" w:hAnsi="Verdana"/>
-          <w:sz w:val="22"/>
-          <w:szCs w:val="22"/>
-        </w:rPr>
-      </w:pPr>
-    </w:p>
-    <w:p>
-      <w:pPr>
-        <w:rPr>
-          <w:rFonts w:ascii="Verdana" w:hAnsi="Verdana"/>
-          <w:sz w:val="22"/>
-          <w:szCs w:val="22"/>
-        </w:rPr>
-      </w:pPr>
-      <w:r>
-        <w:rPr>
-          <w:rFonts w:ascii="Verdana" w:hAnsi="Verdana"/>
-          <w:sz w:val="22"/>
-          <w:szCs w:val="22"/>
-        </w:rPr>
-        <w:t xml:space="preserve">Project </w:t>
-      </w:r>
-      <w:r>
-        <w:rPr>
-          <w:rFonts w:ascii="Verdana" w:hAnsi="Verdana"/>
-          <w:sz w:val="22"/>
-          <w:szCs w:val="22"/>
-        </w:rPr>
-        <w:t>Title:</w:t>
-      </w:r>
-      <w:r>
-        <w:rPr>
-          <w:rFonts w:ascii="Verdana" w:hAnsi="Verdana"/>
-          <w:sz w:val="22"/>
-          <w:szCs w:val="22"/>
-        </w:rPr>
-        <w:t xml:space="preserve"> </w:t>
-      </w:r>
-      <w:r>
-        <w:rPr>
-          <w:rFonts w:ascii="Verdana" w:hAnsi="Verdana"/>
-          <w:sz w:val="22"/>
-          <w:szCs w:val="22"/>
-          <w:highlight w:val="yellow"/>
-        </w:rPr>
-        <w:t>I Dunno</w:t>
-      </w:r>
-    </w:p>
-    <w:p>
-      <w:pPr>
+        <w:t>: How AI Learns to Identify Species</w:t>
+      </w:r>
+    </w:p>
+    <w:p>
+      <w:pPr>
+        <w:jc w:val="both"/>
         <w:rPr>
           <w:rFonts w:ascii="Verdana" w:hAnsi="Verdana"/>
           <w:sz w:val="22"/>
@@ -499,14 +522,20 @@
           <w:ilvl w:val="0"/>
           <w:numId w:val="4"/>
         </w:numPr>
+        <w:jc w:val="both"/>
       </w:pPr>
       <w:r>
         <w:t>Problem Statement</w:t>
       </w:r>
     </w:p>
-    <w:p/>
-    <w:p>
-      <w:pPr>
+    <w:p>
+      <w:pPr>
+        <w:jc w:val="both"/>
+      </w:pPr>
+    </w:p>
+    <w:p>
+      <w:pPr>
+        <w:jc w:val="both"/>
         <w:rPr>
           <w:rFonts w:ascii="Verdana" w:hAnsi="Verdana"/>
           <w:sz w:val="22"/>
@@ -544,16 +573,18 @@
     </w:p>
     <w:p>
       <w:pPr>
-        <w:rPr>
-          <w:rFonts w:ascii="Verdana" w:hAnsi="Verdana"/>
-          <w:sz w:val="22"/>
-          <w:szCs w:val="22"/>
-          <w:lang w:val="en-SG"/>
-        </w:rPr>
-      </w:pPr>
-    </w:p>
-    <w:p>
-      <w:pPr>
+        <w:jc w:val="both"/>
+        <w:rPr>
+          <w:rFonts w:ascii="Verdana" w:hAnsi="Verdana"/>
+          <w:sz w:val="22"/>
+          <w:szCs w:val="22"/>
+          <w:lang w:val="en-SG"/>
+        </w:rPr>
+      </w:pPr>
+    </w:p>
+    <w:p>
+      <w:pPr>
+        <w:jc w:val="both"/>
         <w:rPr>
           <w:rFonts w:ascii="Verdana" w:hAnsi="Verdana"/>
           <w:sz w:val="22"/>
@@ -573,16 +604,18 @@
     </w:p>
     <w:p>
       <w:pPr>
-        <w:rPr>
-          <w:rFonts w:ascii="Verdana" w:hAnsi="Verdana"/>
-          <w:sz w:val="22"/>
-          <w:szCs w:val="22"/>
-          <w:lang w:val="en-SG"/>
-        </w:rPr>
-      </w:pPr>
-    </w:p>
-    <w:p>
-      <w:pPr>
+        <w:jc w:val="both"/>
+        <w:rPr>
+          <w:rFonts w:ascii="Verdana" w:hAnsi="Verdana"/>
+          <w:sz w:val="22"/>
+          <w:szCs w:val="22"/>
+          <w:lang w:val="en-SG"/>
+        </w:rPr>
+      </w:pPr>
+    </w:p>
+    <w:p>
+      <w:pPr>
+        <w:jc w:val="both"/>
         <w:rPr>
           <w:rFonts w:ascii="Verdana" w:hAnsi="Verdana"/>
           <w:sz w:val="22"/>
@@ -602,16 +635,18 @@
     </w:p>
     <w:p>
       <w:pPr>
-        <w:rPr>
-          <w:rFonts w:ascii="Verdana" w:hAnsi="Verdana"/>
-          <w:sz w:val="22"/>
-          <w:szCs w:val="22"/>
-          <w:lang w:val="en-SG"/>
-        </w:rPr>
-      </w:pPr>
-    </w:p>
-    <w:p>
-      <w:pPr>
+        <w:jc w:val="both"/>
+        <w:rPr>
+          <w:rFonts w:ascii="Verdana" w:hAnsi="Verdana"/>
+          <w:sz w:val="22"/>
+          <w:szCs w:val="22"/>
+          <w:lang w:val="en-SG"/>
+        </w:rPr>
+      </w:pPr>
+    </w:p>
+    <w:p>
+      <w:pPr>
+        <w:jc w:val="both"/>
         <w:rPr>
           <w:rFonts w:ascii="Verdana" w:hAnsi="Verdana"/>
           <w:sz w:val="22"/>
@@ -631,16 +666,18 @@
     </w:p>
     <w:p>
       <w:pPr>
-        <w:rPr>
-          <w:rFonts w:ascii="Verdana" w:hAnsi="Verdana"/>
-          <w:sz w:val="22"/>
-          <w:szCs w:val="22"/>
-          <w:lang w:val="en-SG"/>
-        </w:rPr>
-      </w:pPr>
-    </w:p>
-    <w:p>
-      <w:pPr>
+        <w:jc w:val="both"/>
+        <w:rPr>
+          <w:rFonts w:ascii="Verdana" w:hAnsi="Verdana"/>
+          <w:sz w:val="22"/>
+          <w:szCs w:val="22"/>
+          <w:lang w:val="en-SG"/>
+        </w:rPr>
+      </w:pPr>
+    </w:p>
+    <w:p>
+      <w:pPr>
+        <w:jc w:val="both"/>
         <w:rPr>
           <w:rFonts w:ascii="Verdana" w:hAnsi="Verdana"/>
           <w:sz w:val="22"/>
@@ -678,6 +715,7 @@
     </w:p>
     <w:p>
       <w:pPr>
+        <w:jc w:val="both"/>
         <w:rPr>
           <w:rFonts w:ascii="Verdana" w:hAnsi="Verdana"/>
           <w:sz w:val="22"/>
@@ -692,15 +730,21 @@
           <w:ilvl w:val="0"/>
           <w:numId w:val="4"/>
         </w:numPr>
+        <w:jc w:val="both"/>
       </w:pPr>
       <w:r>
         <w:lastRenderedPageBreak/>
         <w:t>Proposed Methodology</w:t>
       </w:r>
     </w:p>
-    <w:p/>
-    <w:p>
-      <w:pPr>
+    <w:p>
+      <w:pPr>
+        <w:jc w:val="both"/>
+      </w:pPr>
+    </w:p>
+    <w:p>
+      <w:pPr>
+        <w:jc w:val="both"/>
         <w:rPr>
           <w:rFonts w:ascii="Verdana" w:hAnsi="Verdana"/>
           <w:sz w:val="22"/>
@@ -810,6 +854,7 @@
     </w:p>
     <w:p>
       <w:pPr>
+        <w:jc w:val="both"/>
         <w:rPr>
           <w:rFonts w:ascii="Verdana" w:hAnsi="Verdana"/>
           <w:sz w:val="22"/>
@@ -825,6 +870,7 @@
           <w:ilvl w:val="1"/>
           <w:numId w:val="4"/>
         </w:numPr>
+        <w:jc w:val="both"/>
         <w:rPr>
           <w:rFonts w:ascii="Verdana" w:hAnsi="Verdana"/>
           <w:sz w:val="22"/>
@@ -844,16 +890,18 @@
     </w:p>
     <w:p>
       <w:pPr>
-        <w:rPr>
-          <w:rFonts w:ascii="Verdana" w:hAnsi="Verdana"/>
-          <w:sz w:val="22"/>
-          <w:szCs w:val="22"/>
-          <w:lang w:val="en-SG"/>
-        </w:rPr>
-      </w:pPr>
-    </w:p>
-    <w:p>
-      <w:pPr>
+        <w:jc w:val="both"/>
+        <w:rPr>
+          <w:rFonts w:ascii="Verdana" w:hAnsi="Verdana"/>
+          <w:sz w:val="22"/>
+          <w:szCs w:val="22"/>
+          <w:lang w:val="en-SG"/>
+        </w:rPr>
+      </w:pPr>
+    </w:p>
+    <w:p>
+      <w:pPr>
+        <w:jc w:val="both"/>
         <w:rPr>
           <w:rFonts w:ascii="Verdana" w:hAnsi="Verdana"/>
           <w:sz w:val="22"/>
@@ -888,7 +936,25 @@
           <w:szCs w:val="22"/>
           <w:lang w:val="en-SG"/>
         </w:rPr>
-        <w:t xml:space="preserve">, an open source API that provides extensive data on </w:t>
+        <w:t xml:space="preserve">, an </w:t>
+      </w:r>
+      <w:r>
+        <w:rPr>
+          <w:rFonts w:ascii="Verdana" w:hAnsi="Verdana"/>
+          <w:sz w:val="22"/>
+          <w:szCs w:val="22"/>
+          <w:lang w:val="en-SG"/>
+        </w:rPr>
+        <w:t>open-source</w:t>
+      </w:r>
+      <w:r>
+        <w:rPr>
+          <w:rFonts w:ascii="Verdana" w:hAnsi="Verdana"/>
+          <w:sz w:val="22"/>
+          <w:szCs w:val="22"/>
+          <w:lang w:val="en-SG"/>
+        </w:rPr>
+        <w:t xml:space="preserve"> API that provides extensive data on </w:t>
       </w:r>
       <w:proofErr w:type="spellStart"/>
       <w:r>
@@ -910,6 +976,24 @@
         </w:rPr>
         <w:t xml:space="preserve"> including their types, attributes and images. The dataset will include </w:t>
       </w:r>
+      <w:r>
+        <w:rPr>
+          <w:rFonts w:ascii="Verdana" w:hAnsi="Verdana"/>
+          <w:sz w:val="22"/>
+          <w:szCs w:val="22"/>
+          <w:lang w:val="en-SG"/>
+        </w:rPr>
+        <w:t xml:space="preserve">Pokémon </w:t>
+      </w:r>
+      <w:r>
+        <w:rPr>
+          <w:rFonts w:ascii="Verdana" w:hAnsi="Verdana"/>
+          <w:sz w:val="22"/>
+          <w:szCs w:val="22"/>
+          <w:lang w:val="en-SG"/>
+        </w:rPr>
+        <w:t xml:space="preserve">artwork and sprites along with their corresponding </w:t>
+      </w:r>
       <w:proofErr w:type="spellStart"/>
       <w:r>
         <w:rPr>
@@ -918,7 +1002,7 @@
           <w:szCs w:val="22"/>
           <w:lang w:val="en-SG"/>
         </w:rPr>
-        <w:t>Pokemon</w:t>
+        <w:t>typings</w:t>
       </w:r>
       <w:proofErr w:type="spellEnd"/>
       <w:r>
@@ -928,7 +1012,7 @@
           <w:szCs w:val="22"/>
           <w:lang w:val="en-SG"/>
         </w:rPr>
-        <w:t xml:space="preserve"> artwork and sprites along with their corresponding </w:t>
+        <w:t xml:space="preserve">. For our project, we will be focusing on the first 7 generations of </w:t>
       </w:r>
       <w:proofErr w:type="spellStart"/>
       <w:r>
@@ -938,7 +1022,7 @@
           <w:szCs w:val="22"/>
           <w:lang w:val="en-SG"/>
         </w:rPr>
-        <w:t>typings</w:t>
+        <w:t>pokemon</w:t>
       </w:r>
       <w:proofErr w:type="spellEnd"/>
       <w:r>
@@ -948,31 +1032,12 @@
           <w:szCs w:val="22"/>
           <w:lang w:val="en-SG"/>
         </w:rPr>
-        <w:t xml:space="preserve">. For our project, we will be focusing on the first 7 generations of </w:t>
-      </w:r>
-      <w:proofErr w:type="spellStart"/>
-      <w:r>
-        <w:rPr>
-          <w:rFonts w:ascii="Verdana" w:hAnsi="Verdana"/>
-          <w:sz w:val="22"/>
-          <w:szCs w:val="22"/>
-          <w:lang w:val="en-SG"/>
-        </w:rPr>
-        <w:t>pokemon</w:t>
-      </w:r>
-      <w:proofErr w:type="spellEnd"/>
-      <w:r>
-        <w:rPr>
-          <w:rFonts w:ascii="Verdana" w:hAnsi="Verdana"/>
-          <w:sz w:val="22"/>
-          <w:szCs w:val="22"/>
-          <w:lang w:val="en-SG"/>
-        </w:rPr>
         <w:t xml:space="preserve">. </w:t>
       </w:r>
     </w:p>
     <w:p>
       <w:pPr>
+        <w:jc w:val="both"/>
         <w:rPr>
           <w:rFonts w:ascii="Verdana" w:hAnsi="Verdana"/>
           <w:sz w:val="22"/>
@@ -988,6 +1053,7 @@
           <w:ilvl w:val="1"/>
           <w:numId w:val="4"/>
         </w:numPr>
+        <w:jc w:val="both"/>
         <w:rPr>
           <w:rFonts w:ascii="Verdana" w:hAnsi="Verdana"/>
           <w:sz w:val="22"/>
@@ -1016,31 +1082,150 @@
     </w:p>
     <w:p>
       <w:pPr>
-        <w:rPr>
-          <w:rFonts w:ascii="Verdana" w:hAnsi="Verdana"/>
-          <w:sz w:val="22"/>
-          <w:szCs w:val="22"/>
-          <w:lang w:val="en-SG"/>
-        </w:rPr>
-      </w:pPr>
-    </w:p>
-    <w:p>
-      <w:pPr>
-        <w:rPr>
-          <w:rFonts w:ascii="Verdana" w:hAnsi="Verdana"/>
-          <w:sz w:val="22"/>
-          <w:szCs w:val="22"/>
-          <w:lang w:val="en-SG"/>
-        </w:rPr>
-      </w:pPr>
-      <w:r>
-        <w:rPr>
-          <w:rFonts w:ascii="Verdana" w:hAnsi="Verdana"/>
-          <w:sz w:val="22"/>
-          <w:szCs w:val="22"/>
-          <w:lang w:val="en-SG"/>
-        </w:rPr>
-        <w:t xml:space="preserve">We will conduct Exploratory Data Analysis to better understand the dataset. First, we will randomly select some images to check for quality and consistency in the images as well as to verify that the images are fit for the model. Next, we intend to visualize the distribution of different </w:t>
+        <w:jc w:val="both"/>
+        <w:rPr>
+          <w:rFonts w:ascii="Verdana" w:hAnsi="Verdana"/>
+          <w:sz w:val="22"/>
+          <w:szCs w:val="22"/>
+          <w:lang w:val="en-SG"/>
+        </w:rPr>
+      </w:pPr>
+    </w:p>
+    <w:p>
+      <w:pPr>
+        <w:jc w:val="both"/>
+        <w:rPr>
+          <w:rFonts w:ascii="Verdana" w:hAnsi="Verdana"/>
+          <w:sz w:val="22"/>
+          <w:szCs w:val="22"/>
+          <w:lang w:val="en-SG"/>
+        </w:rPr>
+      </w:pPr>
+      <w:r>
+        <w:rPr>
+          <w:rFonts w:ascii="Verdana" w:hAnsi="Verdana"/>
+          <w:sz w:val="22"/>
+          <w:szCs w:val="22"/>
+          <w:lang w:val="en-SG"/>
+        </w:rPr>
+        <w:t>We will begin with Exploratory Data Analysis to gain a deeper understanding of the dataset</w:t>
+      </w:r>
+      <w:r>
+        <w:rPr>
+          <w:rFonts w:ascii="Verdana" w:hAnsi="Verdana"/>
+          <w:sz w:val="22"/>
+          <w:szCs w:val="22"/>
+          <w:lang w:val="en-SG"/>
+        </w:rPr>
+        <w:t>.</w:t>
+      </w:r>
+      <w:r>
+        <w:rPr>
+          <w:rFonts w:ascii="Verdana" w:hAnsi="Verdana"/>
+          <w:sz w:val="22"/>
+          <w:szCs w:val="22"/>
+          <w:lang w:val="en-SG"/>
+        </w:rPr>
+        <w:t xml:space="preserve"> </w:t>
+      </w:r>
+      <w:r>
+        <w:rPr>
+          <w:rFonts w:ascii="Verdana" w:hAnsi="Verdana"/>
+          <w:sz w:val="22"/>
+          <w:szCs w:val="22"/>
+          <w:lang w:val="en-SG"/>
+        </w:rPr>
+        <w:t>First, we will randomly select s</w:t>
+      </w:r>
+      <w:r>
+        <w:rPr>
+          <w:rFonts w:ascii="Verdana" w:hAnsi="Verdana"/>
+          <w:sz w:val="22"/>
+          <w:szCs w:val="22"/>
+          <w:lang w:val="en-SG"/>
+        </w:rPr>
+        <w:t>ample</w:t>
+      </w:r>
+      <w:r>
+        <w:rPr>
+          <w:rFonts w:ascii="Verdana" w:hAnsi="Verdana"/>
+          <w:sz w:val="22"/>
+          <w:szCs w:val="22"/>
+          <w:lang w:val="en-SG"/>
+        </w:rPr>
+        <w:t xml:space="preserve"> images to </w:t>
+      </w:r>
+      <w:r>
+        <w:rPr>
+          <w:rFonts w:ascii="Verdana" w:hAnsi="Verdana"/>
+          <w:sz w:val="22"/>
+          <w:szCs w:val="22"/>
+          <w:lang w:val="en-SG"/>
+        </w:rPr>
+        <w:t>assess their</w:t>
+      </w:r>
+      <w:r>
+        <w:rPr>
+          <w:rFonts w:ascii="Verdana" w:hAnsi="Verdana"/>
+          <w:sz w:val="22"/>
+          <w:szCs w:val="22"/>
+          <w:lang w:val="en-SG"/>
+        </w:rPr>
+        <w:t xml:space="preserve"> quality</w:t>
+      </w:r>
+      <w:r>
+        <w:rPr>
+          <w:rFonts w:ascii="Verdana" w:hAnsi="Verdana"/>
+          <w:sz w:val="22"/>
+          <w:szCs w:val="22"/>
+          <w:lang w:val="en-SG"/>
+        </w:rPr>
+        <w:t>,</w:t>
+      </w:r>
+      <w:r>
+        <w:rPr>
+          <w:rFonts w:ascii="Verdana" w:hAnsi="Verdana"/>
+          <w:sz w:val="22"/>
+          <w:szCs w:val="22"/>
+          <w:lang w:val="en-SG"/>
+        </w:rPr>
+        <w:t xml:space="preserve"> consistency</w:t>
+      </w:r>
+      <w:r>
+        <w:rPr>
+          <w:rFonts w:ascii="Verdana" w:hAnsi="Verdana"/>
+          <w:sz w:val="22"/>
+          <w:szCs w:val="22"/>
+          <w:lang w:val="en-SG"/>
+        </w:rPr>
+        <w:t>,</w:t>
+      </w:r>
+      <w:r>
+        <w:rPr>
+          <w:rFonts w:ascii="Verdana" w:hAnsi="Verdana"/>
+          <w:sz w:val="22"/>
+          <w:szCs w:val="22"/>
+          <w:lang w:val="en-SG"/>
+        </w:rPr>
+        <w:t xml:space="preserve"> </w:t>
+      </w:r>
+      <w:r>
+        <w:rPr>
+          <w:rFonts w:ascii="Verdana" w:hAnsi="Verdana"/>
+          <w:sz w:val="22"/>
+          <w:szCs w:val="22"/>
+          <w:lang w:val="en-SG"/>
+        </w:rPr>
+        <w:t>and suitability for model training</w:t>
+      </w:r>
+      <w:r>
+        <w:rPr>
+          <w:rFonts w:ascii="Verdana" w:hAnsi="Verdana"/>
+          <w:sz w:val="22"/>
+          <w:szCs w:val="22"/>
+          <w:lang w:val="en-SG"/>
+        </w:rPr>
+        <w:t xml:space="preserve">. Next, we intend to visualize the distribution of different </w:t>
       </w:r>
       <w:proofErr w:type="spellStart"/>
       <w:r>
@@ -1060,19 +1245,89 @@
           <w:szCs w:val="22"/>
           <w:lang w:val="en-SG"/>
         </w:rPr>
-        <w:t xml:space="preserve"> to verify for any class imbalances in the dataset. Next, we will plot histograms to observe common visual characteristics of each </w:t>
-      </w:r>
-      <w:proofErr w:type="spellStart"/>
-      <w:r>
-        <w:rPr>
-          <w:rFonts w:ascii="Verdana" w:hAnsi="Verdana"/>
-          <w:sz w:val="22"/>
-          <w:szCs w:val="22"/>
-          <w:lang w:val="en-SG"/>
-        </w:rPr>
-        <w:t>pokemon</w:t>
-      </w:r>
-      <w:proofErr w:type="spellEnd"/>
+        <w:t xml:space="preserve"> to verify for any class imbalances in the dataset. </w:t>
+      </w:r>
+      <w:r>
+        <w:rPr>
+          <w:rFonts w:ascii="Verdana" w:hAnsi="Verdana"/>
+          <w:sz w:val="22"/>
+          <w:szCs w:val="22"/>
+          <w:lang w:val="en-SG"/>
+        </w:rPr>
+        <w:t>To further analyse visual characteristics</w:t>
+      </w:r>
+      <w:r>
+        <w:rPr>
+          <w:rFonts w:ascii="Verdana" w:hAnsi="Verdana"/>
+          <w:sz w:val="22"/>
+          <w:szCs w:val="22"/>
+          <w:lang w:val="en-SG"/>
+        </w:rPr>
+        <w:t xml:space="preserve">, we will </w:t>
+      </w:r>
+      <w:r>
+        <w:rPr>
+          <w:rFonts w:ascii="Verdana" w:hAnsi="Verdana"/>
+          <w:sz w:val="22"/>
+          <w:szCs w:val="22"/>
+          <w:lang w:val="en-SG"/>
+        </w:rPr>
+        <w:t>generate</w:t>
+      </w:r>
+      <w:r>
+        <w:rPr>
+          <w:rFonts w:ascii="Verdana" w:hAnsi="Verdana"/>
+          <w:sz w:val="22"/>
+          <w:szCs w:val="22"/>
+          <w:lang w:val="en-SG"/>
+        </w:rPr>
+        <w:t xml:space="preserve"> histograms to </w:t>
+      </w:r>
+      <w:r>
+        <w:rPr>
+          <w:rFonts w:ascii="Verdana" w:hAnsi="Verdana"/>
+          <w:sz w:val="22"/>
+          <w:szCs w:val="22"/>
+          <w:lang w:val="en-SG"/>
+        </w:rPr>
+        <w:t>highlight</w:t>
+      </w:r>
+      <w:r>
+        <w:rPr>
+          <w:rFonts w:ascii="Verdana" w:hAnsi="Verdana"/>
+          <w:sz w:val="22"/>
+          <w:szCs w:val="22"/>
+          <w:lang w:val="en-SG"/>
+        </w:rPr>
+        <w:t xml:space="preserve"> common visual characteristics </w:t>
+      </w:r>
+      <w:r>
+        <w:rPr>
+          <w:rFonts w:ascii="Verdana" w:hAnsi="Verdana"/>
+          <w:sz w:val="22"/>
+          <w:szCs w:val="22"/>
+          <w:lang w:val="en-SG"/>
+        </w:rPr>
+        <w:t>associated with</w:t>
+      </w:r>
+      <w:r>
+        <w:rPr>
+          <w:rFonts w:ascii="Verdana" w:hAnsi="Verdana"/>
+          <w:sz w:val="22"/>
+          <w:szCs w:val="22"/>
+          <w:lang w:val="en-SG"/>
+        </w:rPr>
+        <w:t xml:space="preserve"> each </w:t>
+      </w:r>
+      <w:r>
+        <w:rPr>
+          <w:rFonts w:ascii="Verdana" w:hAnsi="Verdana"/>
+          <w:sz w:val="22"/>
+          <w:szCs w:val="22"/>
+          <w:lang w:val="en-SG"/>
+        </w:rPr>
+        <w:t>Pokémon</w:t>
+      </w:r>
       <w:r>
         <w:rPr>
           <w:rFonts w:ascii="Verdana" w:hAnsi="Verdana"/>
@@ -1089,49 +1344,138 @@
           <w:szCs w:val="22"/>
           <w:lang w:val="en-SG"/>
         </w:rPr>
-        <w:t>Next</w:t>
-      </w:r>
-      <w:r>
-        <w:rPr>
-          <w:rFonts w:ascii="Verdana" w:hAnsi="Verdana"/>
-          <w:sz w:val="22"/>
-          <w:szCs w:val="22"/>
-          <w:lang w:val="en-SG"/>
-        </w:rPr>
-        <w:t xml:space="preserve">, we will inspect whether there are any missing or incomplete data entries in the </w:t>
-      </w:r>
-      <w:proofErr w:type="spellStart"/>
-      <w:r>
-        <w:rPr>
-          <w:rFonts w:ascii="Verdana" w:hAnsi="Verdana"/>
-          <w:sz w:val="22"/>
-          <w:szCs w:val="22"/>
-          <w:lang w:val="en-SG"/>
-        </w:rPr>
-        <w:t>pokemon</w:t>
-      </w:r>
-      <w:proofErr w:type="spellEnd"/>
-      <w:r>
-        <w:rPr>
-          <w:rFonts w:ascii="Verdana" w:hAnsi="Verdana"/>
-          <w:sz w:val="22"/>
-          <w:szCs w:val="22"/>
-          <w:lang w:val="en-SG"/>
-        </w:rPr>
-        <w:t xml:space="preserve"> dataset and either remove these entries or impute them based on other web sources. </w:t>
-      </w:r>
-      <w:r>
-        <w:rPr>
-          <w:rFonts w:ascii="Verdana" w:hAnsi="Verdana"/>
-          <w:sz w:val="22"/>
-          <w:szCs w:val="22"/>
-          <w:lang w:val="en-SG"/>
-        </w:rPr>
-        <w:t xml:space="preserve">Lastly, we will vectorize each image and normalize the pixel values in preparation for the model. </w:t>
-      </w:r>
-    </w:p>
-    <w:p>
-      <w:pPr>
+        <w:t>Additionally</w:t>
+      </w:r>
+      <w:r>
+        <w:rPr>
+          <w:rFonts w:ascii="Verdana" w:hAnsi="Verdana"/>
+          <w:sz w:val="22"/>
+          <w:szCs w:val="22"/>
+          <w:lang w:val="en-SG"/>
+        </w:rPr>
+        <w:t xml:space="preserve">, we will inspect </w:t>
+      </w:r>
+      <w:r>
+        <w:rPr>
+          <w:rFonts w:ascii="Verdana" w:hAnsi="Verdana"/>
+          <w:sz w:val="22"/>
+          <w:szCs w:val="22"/>
+          <w:lang w:val="en-SG"/>
+        </w:rPr>
+        <w:t>for</w:t>
+      </w:r>
+      <w:r>
+        <w:rPr>
+          <w:rFonts w:ascii="Verdana" w:hAnsi="Verdana"/>
+          <w:sz w:val="22"/>
+          <w:szCs w:val="22"/>
+          <w:lang w:val="en-SG"/>
+        </w:rPr>
+        <w:t xml:space="preserve"> any missing or incomplete data entries in the </w:t>
+      </w:r>
+      <w:r>
+        <w:rPr>
+          <w:rFonts w:ascii="Verdana" w:hAnsi="Verdana"/>
+          <w:sz w:val="22"/>
+          <w:szCs w:val="22"/>
+          <w:lang w:val="en-SG"/>
+        </w:rPr>
+        <w:t xml:space="preserve">Pokémon </w:t>
+      </w:r>
+      <w:r>
+        <w:rPr>
+          <w:rFonts w:ascii="Verdana" w:hAnsi="Verdana"/>
+          <w:sz w:val="22"/>
+          <w:szCs w:val="22"/>
+          <w:lang w:val="en-SG"/>
+        </w:rPr>
+        <w:t xml:space="preserve">dataset and </w:t>
+      </w:r>
+      <w:r>
+        <w:rPr>
+          <w:rFonts w:ascii="Verdana" w:hAnsi="Verdana"/>
+          <w:sz w:val="22"/>
+          <w:szCs w:val="22"/>
+          <w:lang w:val="en-SG"/>
+        </w:rPr>
+        <w:t xml:space="preserve">addressing them by </w:t>
+      </w:r>
+      <w:r>
+        <w:rPr>
+          <w:rFonts w:ascii="Verdana" w:hAnsi="Verdana"/>
+          <w:sz w:val="22"/>
+          <w:szCs w:val="22"/>
+          <w:lang w:val="en-SG"/>
+        </w:rPr>
+        <w:t xml:space="preserve">either </w:t>
+      </w:r>
+      <w:r>
+        <w:rPr>
+          <w:rFonts w:ascii="Verdana" w:hAnsi="Verdana"/>
+          <w:sz w:val="22"/>
+          <w:szCs w:val="22"/>
+          <w:lang w:val="en-SG"/>
+        </w:rPr>
+        <w:t>removal</w:t>
+      </w:r>
+      <w:r>
+        <w:rPr>
+          <w:rFonts w:ascii="Verdana" w:hAnsi="Verdana"/>
+          <w:sz w:val="22"/>
+          <w:szCs w:val="22"/>
+          <w:lang w:val="en-SG"/>
+        </w:rPr>
+        <w:t xml:space="preserve"> these entries or </w:t>
+      </w:r>
+      <w:r>
+        <w:rPr>
+          <w:rFonts w:ascii="Verdana" w:hAnsi="Verdana"/>
+          <w:sz w:val="22"/>
+          <w:szCs w:val="22"/>
+          <w:lang w:val="en-SG"/>
+        </w:rPr>
+        <w:t>imputation</w:t>
+      </w:r>
+      <w:r>
+        <w:rPr>
+          <w:rFonts w:ascii="Verdana" w:hAnsi="Verdana"/>
+          <w:sz w:val="22"/>
+          <w:szCs w:val="22"/>
+          <w:lang w:val="en-SG"/>
+        </w:rPr>
+        <w:t xml:space="preserve"> based on other web sources. </w:t>
+      </w:r>
+      <w:r>
+        <w:rPr>
+          <w:rFonts w:ascii="Verdana" w:hAnsi="Verdana"/>
+          <w:sz w:val="22"/>
+          <w:szCs w:val="22"/>
+          <w:lang w:val="en-SG"/>
+        </w:rPr>
+        <w:t xml:space="preserve">Lastly, we will vectorize each image and normalize the pixel values </w:t>
+      </w:r>
+      <w:r>
+        <w:rPr>
+          <w:rFonts w:ascii="Verdana" w:hAnsi="Verdana"/>
+          <w:sz w:val="22"/>
+          <w:szCs w:val="22"/>
+          <w:lang w:val="en-SG"/>
+        </w:rPr>
+        <w:t xml:space="preserve">to ensure optimal preprocessing for </w:t>
+      </w:r>
+      <w:r>
+        <w:rPr>
+          <w:rFonts w:ascii="Verdana" w:hAnsi="Verdana"/>
+          <w:sz w:val="22"/>
+          <w:szCs w:val="22"/>
+          <w:lang w:val="en-SG"/>
+        </w:rPr>
+        <w:t xml:space="preserve">the model. </w:t>
+      </w:r>
+    </w:p>
+    <w:p>
+      <w:pPr>
+        <w:jc w:val="both"/>
         <w:rPr>
           <w:rFonts w:ascii="Verdana" w:hAnsi="Verdana"/>
           <w:sz w:val="22"/>
@@ -1147,6 +1491,7 @@
           <w:ilvl w:val="1"/>
           <w:numId w:val="4"/>
         </w:numPr>
+        <w:jc w:val="both"/>
         <w:rPr>
           <w:rFonts w:ascii="Verdana" w:hAnsi="Verdana"/>
           <w:sz w:val="22"/>
@@ -1175,16 +1520,18 @@
     </w:p>
     <w:p>
       <w:pPr>
-        <w:rPr>
-          <w:rFonts w:ascii="Verdana" w:hAnsi="Verdana"/>
-          <w:sz w:val="22"/>
-          <w:szCs w:val="22"/>
-          <w:lang w:val="en-SG"/>
-        </w:rPr>
-      </w:pPr>
-    </w:p>
-    <w:p>
-      <w:pPr>
+        <w:jc w:val="both"/>
+        <w:rPr>
+          <w:rFonts w:ascii="Verdana" w:hAnsi="Verdana"/>
+          <w:sz w:val="22"/>
+          <w:szCs w:val="22"/>
+          <w:lang w:val="en-SG"/>
+        </w:rPr>
+      </w:pPr>
+    </w:p>
+    <w:p>
+      <w:pPr>
+        <w:jc w:val="both"/>
         <w:rPr>
           <w:rFonts w:ascii="Verdana" w:hAnsi="Verdana"/>
           <w:sz w:val="22"/>
@@ -1244,16 +1591,18 @@
     </w:p>
     <w:p>
       <w:pPr>
-        <w:rPr>
-          <w:rFonts w:ascii="Verdana" w:hAnsi="Verdana"/>
-          <w:sz w:val="22"/>
-          <w:szCs w:val="22"/>
-          <w:lang w:val="en-SG"/>
-        </w:rPr>
-      </w:pPr>
-    </w:p>
-    <w:p>
-      <w:pPr>
+        <w:jc w:val="both"/>
+        <w:rPr>
+          <w:rFonts w:ascii="Verdana" w:hAnsi="Verdana"/>
+          <w:sz w:val="22"/>
+          <w:szCs w:val="22"/>
+          <w:lang w:val="en-SG"/>
+        </w:rPr>
+      </w:pPr>
+    </w:p>
+    <w:p>
+      <w:pPr>
+        <w:jc w:val="both"/>
         <w:rPr>
           <w:rFonts w:ascii="Verdana" w:hAnsi="Verdana"/>
           <w:sz w:val="22"/>
@@ -1302,31 +1651,51 @@
     </w:p>
     <w:p>
       <w:pPr>
-        <w:rPr>
-          <w:rFonts w:ascii="Verdana" w:hAnsi="Verdana"/>
-          <w:sz w:val="22"/>
-          <w:szCs w:val="22"/>
-          <w:lang w:val="en-SG"/>
-        </w:rPr>
-      </w:pPr>
-    </w:p>
-    <w:p>
-      <w:pPr>
-        <w:rPr>
-          <w:rFonts w:ascii="Verdana" w:hAnsi="Verdana"/>
-          <w:sz w:val="22"/>
-          <w:szCs w:val="22"/>
-          <w:lang w:val="en-SG"/>
-        </w:rPr>
-      </w:pPr>
-      <w:r>
-        <w:rPr>
-          <w:rFonts w:ascii="Verdana" w:hAnsi="Verdana"/>
-          <w:sz w:val="22"/>
-          <w:szCs w:val="22"/>
-          <w:lang w:val="en-SG"/>
-        </w:rPr>
-        <w:t>For supervised learning, we will being using techniques such as SVM</w:t>
+        <w:jc w:val="both"/>
+        <w:rPr>
+          <w:rFonts w:ascii="Verdana" w:hAnsi="Verdana"/>
+          <w:sz w:val="22"/>
+          <w:szCs w:val="22"/>
+          <w:lang w:val="en-SG"/>
+        </w:rPr>
+      </w:pPr>
+    </w:p>
+    <w:p>
+      <w:pPr>
+        <w:jc w:val="both"/>
+        <w:rPr>
+          <w:rFonts w:ascii="Verdana" w:hAnsi="Verdana"/>
+          <w:sz w:val="22"/>
+          <w:szCs w:val="22"/>
+          <w:lang w:val="en-SG"/>
+        </w:rPr>
+      </w:pPr>
+      <w:r>
+        <w:rPr>
+          <w:rFonts w:ascii="Verdana" w:hAnsi="Verdana"/>
+          <w:sz w:val="22"/>
+          <w:szCs w:val="22"/>
+          <w:lang w:val="en-SG"/>
+        </w:rPr>
+        <w:t xml:space="preserve">For supervised learning, we will </w:t>
+      </w:r>
+      <w:r>
+        <w:rPr>
+          <w:rFonts w:ascii="Verdana" w:hAnsi="Verdana"/>
+          <w:sz w:val="22"/>
+          <w:szCs w:val="22"/>
+          <w:lang w:val="en-SG"/>
+        </w:rPr>
+        <w:t>be</w:t>
+      </w:r>
+      <w:r>
+        <w:rPr>
+          <w:rFonts w:ascii="Verdana" w:hAnsi="Verdana"/>
+          <w:sz w:val="22"/>
+          <w:szCs w:val="22"/>
+          <w:lang w:val="en-SG"/>
+        </w:rPr>
+        <w:t xml:space="preserve"> using techniques such as SVM</w:t>
       </w:r>
       <w:r>
         <w:rPr>
@@ -1358,16 +1727,18 @@
     </w:p>
     <w:p>
       <w:pPr>
-        <w:rPr>
-          <w:rFonts w:ascii="Verdana" w:hAnsi="Verdana"/>
-          <w:sz w:val="22"/>
-          <w:szCs w:val="22"/>
-          <w:lang w:val="en-SG"/>
-        </w:rPr>
-      </w:pPr>
-    </w:p>
-    <w:p>
-      <w:pPr>
+        <w:jc w:val="both"/>
+        <w:rPr>
+          <w:rFonts w:ascii="Verdana" w:hAnsi="Verdana"/>
+          <w:sz w:val="22"/>
+          <w:szCs w:val="22"/>
+          <w:lang w:val="en-SG"/>
+        </w:rPr>
+      </w:pPr>
+    </w:p>
+    <w:p>
+      <w:pPr>
+        <w:jc w:val="both"/>
         <w:rPr>
           <w:rFonts w:ascii="Verdana" w:hAnsi="Verdana"/>
           <w:sz w:val="22"/>
@@ -1423,66 +1794,73 @@
     </w:p>
     <w:p>
       <w:pPr>
-        <w:rPr>
-          <w:rFonts w:ascii="Verdana" w:hAnsi="Verdana"/>
-          <w:sz w:val="22"/>
-          <w:szCs w:val="22"/>
-          <w:lang w:val="en-SG"/>
-        </w:rPr>
-      </w:pPr>
-    </w:p>
-    <w:p>
-      <w:pPr>
-        <w:rPr>
-          <w:rFonts w:ascii="Verdana" w:hAnsi="Verdana"/>
-          <w:sz w:val="22"/>
-          <w:szCs w:val="22"/>
-          <w:lang w:val="en-SG"/>
-        </w:rPr>
-      </w:pPr>
-    </w:p>
-    <w:p>
-      <w:pPr>
-        <w:rPr>
-          <w:rFonts w:ascii="Verdana" w:hAnsi="Verdana"/>
-          <w:sz w:val="22"/>
-          <w:szCs w:val="22"/>
-          <w:lang w:val="en-SG"/>
-        </w:rPr>
-      </w:pPr>
-    </w:p>
-    <w:p>
-      <w:pPr>
-        <w:rPr>
-          <w:rFonts w:ascii="Verdana" w:hAnsi="Verdana"/>
-          <w:sz w:val="22"/>
-          <w:szCs w:val="22"/>
-          <w:lang w:val="en-SG"/>
-        </w:rPr>
-      </w:pPr>
-    </w:p>
-    <w:p>
-      <w:pPr>
-        <w:rPr>
-          <w:rFonts w:ascii="Verdana" w:hAnsi="Verdana"/>
-          <w:sz w:val="22"/>
-          <w:szCs w:val="22"/>
-          <w:lang w:val="en-SG"/>
-        </w:rPr>
-      </w:pPr>
-    </w:p>
-    <w:p>
-      <w:pPr>
-        <w:rPr>
-          <w:rFonts w:ascii="Verdana" w:hAnsi="Verdana"/>
-          <w:sz w:val="22"/>
-          <w:szCs w:val="22"/>
-          <w:lang w:val="en-SG"/>
-        </w:rPr>
-      </w:pPr>
-    </w:p>
-    <w:p>
-      <w:pPr>
+        <w:jc w:val="both"/>
+        <w:rPr>
+          <w:rFonts w:ascii="Verdana" w:hAnsi="Verdana"/>
+          <w:sz w:val="22"/>
+          <w:szCs w:val="22"/>
+          <w:lang w:val="en-SG"/>
+        </w:rPr>
+      </w:pPr>
+    </w:p>
+    <w:p>
+      <w:pPr>
+        <w:jc w:val="both"/>
+        <w:rPr>
+          <w:rFonts w:ascii="Verdana" w:hAnsi="Verdana"/>
+          <w:sz w:val="22"/>
+          <w:szCs w:val="22"/>
+          <w:lang w:val="en-SG"/>
+        </w:rPr>
+      </w:pPr>
+    </w:p>
+    <w:p>
+      <w:pPr>
+        <w:jc w:val="both"/>
+        <w:rPr>
+          <w:rFonts w:ascii="Verdana" w:hAnsi="Verdana"/>
+          <w:sz w:val="22"/>
+          <w:szCs w:val="22"/>
+          <w:lang w:val="en-SG"/>
+        </w:rPr>
+      </w:pPr>
+    </w:p>
+    <w:p>
+      <w:pPr>
+        <w:jc w:val="both"/>
+        <w:rPr>
+          <w:rFonts w:ascii="Verdana" w:hAnsi="Verdana"/>
+          <w:sz w:val="22"/>
+          <w:szCs w:val="22"/>
+          <w:lang w:val="en-SG"/>
+        </w:rPr>
+      </w:pPr>
+    </w:p>
+    <w:p>
+      <w:pPr>
+        <w:jc w:val="both"/>
+        <w:rPr>
+          <w:rFonts w:ascii="Verdana" w:hAnsi="Verdana"/>
+          <w:sz w:val="22"/>
+          <w:szCs w:val="22"/>
+          <w:lang w:val="en-SG"/>
+        </w:rPr>
+      </w:pPr>
+    </w:p>
+    <w:p>
+      <w:pPr>
+        <w:jc w:val="both"/>
+        <w:rPr>
+          <w:rFonts w:ascii="Verdana" w:hAnsi="Verdana"/>
+          <w:sz w:val="22"/>
+          <w:szCs w:val="22"/>
+          <w:lang w:val="en-SG"/>
+        </w:rPr>
+      </w:pPr>
+    </w:p>
+    <w:p>
+      <w:pPr>
+        <w:jc w:val="both"/>
         <w:rPr>
           <w:rFonts w:ascii="Verdana" w:hAnsi="Verdana"/>
           <w:sz w:val="22"/>
@@ -1497,39 +1875,95 @@
           <w:ilvl w:val="0"/>
           <w:numId w:val="4"/>
         </w:numPr>
+        <w:jc w:val="both"/>
       </w:pPr>
       <w:r>
         <w:lastRenderedPageBreak/>
         <w:t>Planned Evaluation Strategies</w:t>
       </w:r>
     </w:p>
-    <w:p/>
-    <w:p>
+    <w:p>
+      <w:pPr>
+        <w:jc w:val="both"/>
+      </w:pPr>
+    </w:p>
+    <w:p>
+      <w:pPr>
+        <w:jc w:val="both"/>
+      </w:pPr>
       <w:r>
         <w:t xml:space="preserve">Each class of models will be evaluated separately. </w:t>
       </w:r>
     </w:p>
-    <w:p/>
-    <w:p>
-      <w:r>
-        <w:t xml:space="preserve">For unsupervised learning models, we will be using PCA to reduce the dimensionality of the images to 2 dimensions and plotting them to visualize the groups to determine if the groupings make sense and to see if we can find any insights like a </w:t>
+    <w:p>
+      <w:pPr>
+        <w:jc w:val="both"/>
+      </w:pPr>
+    </w:p>
+    <w:p>
+      <w:pPr>
+        <w:jc w:val="both"/>
+      </w:pPr>
+      <w:r>
+        <w:t>For unsupervised learning models, we will be using PCA to reduce the dimensionality of the images to 2 dimensions</w:t>
+      </w:r>
+      <w:r>
+        <w:t xml:space="preserve">, allowing us to visualize how Pokémon naturally cluster based on their visual features. This can </w:t>
+      </w:r>
+      <w:r>
+        <w:t>help</w:t>
+      </w:r>
+      <w:r>
+        <w:t xml:space="preserve"> determine whether the groupings align with official </w:t>
       </w:r>
       <w:proofErr w:type="spellStart"/>
       <w:r>
-        <w:t>pokemon</w:t>
+        <w:t>typings</w:t>
       </w:r>
       <w:proofErr w:type="spellEnd"/>
       <w:r>
-        <w:t xml:space="preserve"> whose typing is different from a grouping but makes more sense in another group (like Charizard being a dragon instead of flying type RICKY HELP ME WRITE THIS BETTER PLS). </w:t>
-      </w:r>
-    </w:p>
-    <w:p/>
-    <w:p>
-      <w:r>
-        <w:t xml:space="preserve">For supervised learning models, each model will be evaluated using key classification metrics including accuracy &amp; precision &amp; recall to evaluate the balance between correctly predicted </w:t>
+        <w:t xml:space="preserve"> or reveal unexpected insights. For instance, Charizard (Fire/Flying) might cluster closer to Dragon-type Pokémon like </w:t>
       </w:r>
       <w:proofErr w:type="spellStart"/>
       <w:r>
+        <w:t>Dragonite</w:t>
+      </w:r>
+      <w:proofErr w:type="spellEnd"/>
+      <w:r>
+        <w:t xml:space="preserve"> rather than Flying-Types like </w:t>
+      </w:r>
+      <w:proofErr w:type="spellStart"/>
+      <w:r>
+        <w:t>Pidgeot</w:t>
+      </w:r>
+      <w:proofErr w:type="spellEnd"/>
+      <w:r>
+        <w:t>, reflecting its dragon-like design despite its official classification.</w:t>
+      </w:r>
+      <w:r>
+        <w:t xml:space="preserve"> </w:t>
+      </w:r>
+    </w:p>
+    <w:p>
+      <w:pPr>
+        <w:jc w:val="both"/>
+      </w:pPr>
+    </w:p>
+    <w:p>
+      <w:pPr>
+        <w:jc w:val="both"/>
+      </w:pPr>
+      <w:r>
+        <w:t xml:space="preserve">For supervised learning models, each model will be evaluated using key classification metrics including accuracy &amp; precision &amp; recall </w:t>
+      </w:r>
+      <w:r>
+        <w:t>evaluating</w:t>
+      </w:r>
+      <w:r>
+        <w:t xml:space="preserve"> the balance between correctly predicted </w:t>
+      </w:r>
+      <w:proofErr w:type="spellStart"/>
+      <w:r>
         <w:t>typings</w:t>
       </w:r>
       <w:proofErr w:type="spellEnd"/>
@@ -1542,46 +1976,108 @@
       </w:r>
       <w:proofErr w:type="spellEnd"/>
       <w:r>
-        <w:t xml:space="preserve">, confusion matrix  to help visualize and understand how well different </w:t>
-      </w:r>
-      <w:proofErr w:type="spellStart"/>
-      <w:r>
-        <w:t>pokemon</w:t>
-      </w:r>
-      <w:proofErr w:type="spellEnd"/>
+        <w:t xml:space="preserve">, confusion </w:t>
+      </w:r>
+      <w:r>
+        <w:t>matrix to</w:t>
+      </w:r>
+      <w:r>
+        <w:t xml:space="preserve"> help visualize and understand how well different </w:t>
+      </w:r>
+      <w:r>
+        <w:t>Pokémon</w:t>
+      </w:r>
       <w:r>
         <w:t xml:space="preserve"> types are distinguish and AUC-ROC curve to assess the ability of the model to distinguish between multiple types simultaneously. </w:t>
       </w:r>
     </w:p>
-    <w:p/>
-    <w:p>
+    <w:p>
+      <w:pPr>
+        <w:jc w:val="both"/>
+      </w:pPr>
+    </w:p>
+    <w:p>
+      <w:pPr>
+        <w:jc w:val="both"/>
+      </w:pPr>
       <w:r>
         <w:t xml:space="preserve">We will also conduct feature importance analysis by plotting color histograms and waterfall diagrams to evaluate the contribution of specific features to model performance. </w:t>
       </w:r>
     </w:p>
-    <w:p/>
-    <w:p>
-      <w:r>
-        <w:t>Lastly, we will document insights gathered from wrong predictions to see if the model (RICKY SAME THING HERE)</w:t>
-      </w:r>
-    </w:p>
-    <w:p/>
-    <w:p/>
-    <w:p/>
-    <w:p/>
-    <w:p/>
-    <w:p/>
-    <w:p>
-      <w:pPr>
-        <w:rPr>
-          <w:rFonts w:ascii="Verdana" w:hAnsi="Verdana"/>
-          <w:sz w:val="22"/>
-          <w:szCs w:val="22"/>
-        </w:rPr>
-      </w:pPr>
-    </w:p>
-    <w:p>
-      <w:pPr>
+    <w:p>
+      <w:pPr>
+        <w:jc w:val="both"/>
+      </w:pPr>
+    </w:p>
+    <w:p>
+      <w:pPr>
+        <w:jc w:val="both"/>
+      </w:pPr>
+      <w:r>
+        <w:t xml:space="preserve">Lastly, we will document insights gathered from wrong predictions to see if the model </w:t>
+      </w:r>
+      <w:r>
+        <w:t xml:space="preserve">exhibits recurring misclassifications and identify potential reasons behind them </w:t>
+      </w:r>
+      <w:r>
+        <w:t>across both supervised and unsupervised learning models.</w:t>
+      </w:r>
+      <w:r>
+        <w:t xml:space="preserve"> These insights will not only help to refine model accuracy but also provide a deeper understanding of </w:t>
+      </w:r>
+      <w:r>
+        <w:t xml:space="preserve">how AI perceives and classifies visual images. This could provide </w:t>
+      </w:r>
+      <w:r>
+        <w:t>guided</w:t>
+      </w:r>
+      <w:r>
+        <w:t xml:space="preserve"> improvements on preprocessing techniques, dataset balancing, or model architecture to better capture subtle but important distinctions.</w:t>
+      </w:r>
+    </w:p>
+    <w:p>
+      <w:pPr>
+        <w:jc w:val="both"/>
+      </w:pPr>
+    </w:p>
+    <w:p>
+      <w:pPr>
+        <w:jc w:val="both"/>
+      </w:pPr>
+    </w:p>
+    <w:p>
+      <w:pPr>
+        <w:jc w:val="both"/>
+      </w:pPr>
+    </w:p>
+    <w:p>
+      <w:pPr>
+        <w:jc w:val="both"/>
+      </w:pPr>
+    </w:p>
+    <w:p>
+      <w:pPr>
+        <w:jc w:val="both"/>
+      </w:pPr>
+    </w:p>
+    <w:p>
+      <w:pPr>
+        <w:jc w:val="both"/>
+      </w:pPr>
+    </w:p>
+    <w:p>
+      <w:pPr>
+        <w:jc w:val="both"/>
+        <w:rPr>
+          <w:rFonts w:ascii="Verdana" w:hAnsi="Verdana"/>
+          <w:sz w:val="22"/>
+          <w:szCs w:val="22"/>
+        </w:rPr>
+      </w:pPr>
+    </w:p>
+    <w:p>
+      <w:pPr>
+        <w:jc w:val="both"/>
         <w:rPr>
           <w:rFonts w:ascii="Verdana" w:hAnsi="Verdana"/>
           <w:sz w:val="22"/>
@@ -1592,6 +2088,7 @@
     <w:p>
       <w:pPr>
         <w:ind w:firstLine="720"/>
+        <w:jc w:val="both"/>
         <w:rPr>
           <w:rFonts w:ascii="Verdana" w:hAnsi="Verdana"/>
           <w:i/>
@@ -4178,4 +4675,187 @@
   </a:objectDefaults>
   <a:extraClrSchemeLst/>
 </a:theme>
+</file>
+
+<file path=customXml/item1.xml><?xml version="1.0" encoding="utf-8"?>
+<ct:contentTypeSchema xmlns:ct="http://schemas.microsoft.com/office/2006/metadata/contentType" xmlns:ma="http://schemas.microsoft.com/office/2006/metadata/properties/metaAttributes" ct:_="" ma:_="" ma:contentTypeName="Document" ma:contentTypeID="0x010100689F66AA56234D479A9E22023185EB57" ma:contentTypeVersion="1" ma:contentTypeDescription="Create a new document." ma:contentTypeScope="" ma:versionID="3877ad041e81f1260ea3050e5d70c59c">
+  <xsd:schema xmlns:xsd="http://www.w3.org/2001/XMLSchema" xmlns:xs="http://www.w3.org/2001/XMLSchema" xmlns:p="http://schemas.microsoft.com/office/2006/metadata/properties" xmlns:ns3="22d73a51-a696-4308-afbc-2b8a91add569" targetNamespace="http://schemas.microsoft.com/office/2006/metadata/properties" ma:root="true" ma:fieldsID="891b2a12daf7d56684ffb1c8b79eee48" ns3:_="">
+    <xsd:import namespace="22d73a51-a696-4308-afbc-2b8a91add569"/>
+    <xsd:element name="properties">
+      <xsd:complexType>
+        <xsd:sequence>
+          <xsd:element name="documentManagement">
+            <xsd:complexType>
+              <xsd:all>
+                <xsd:element ref="ns3:MediaServiceDateTaken" minOccurs="0"/>
+              </xsd:all>
+            </xsd:complexType>
+          </xsd:element>
+        </xsd:sequence>
+      </xsd:complexType>
+    </xsd:element>
+  </xsd:schema>
+  <xsd:schema xmlns:xsd="http://www.w3.org/2001/XMLSchema" xmlns:xs="http://www.w3.org/2001/XMLSchema" xmlns:dms="http://schemas.microsoft.com/office/2006/documentManagement/types" xmlns:pc="http://schemas.microsoft.com/office/infopath/2007/PartnerControls" targetNamespace="22d73a51-a696-4308-afbc-2b8a91add569" elementFormDefault="qualified">
+    <xsd:import namespace="http://schemas.microsoft.com/office/2006/documentManagement/types"/>
+    <xsd:import namespace="http://schemas.microsoft.com/office/infopath/2007/PartnerControls"/>
+    <xsd:element name="MediaServiceDateTaken" ma:index="8" nillable="true" ma:displayName="MediaServiceDateTaken" ma:hidden="true" ma:indexed="true" ma:internalName="MediaServiceDateTaken" ma:readOnly="true">
+      <xsd:simpleType>
+        <xsd:restriction base="dms:Text"/>
+      </xsd:simpleType>
+    </xsd:element>
+  </xsd:schema>
+  <xsd:schema xmlns="http://schemas.openxmlformats.org/package/2006/metadata/core-properties" xmlns:xsd="http://www.w3.org/2001/XMLSchema" xmlns:xsi="http://www.w3.org/2001/XMLSchema-instance" xmlns:dc="http://purl.org/dc/elements/1.1/" xmlns:dcterms="http://purl.org/dc/terms/" xmlns:odoc="http://schemas.microsoft.com/internal/obd" targetNamespace="http://schemas.openxmlformats.org/package/2006/metadata/core-properties" elementFormDefault="qualified" attributeFormDefault="unqualified" blockDefault="#all">
+    <xsd:import namespace="http://purl.org/dc/elements/1.1/" schemaLocation="http://dublincore.org/schemas/xmls/qdc/2003/04/02/dc.xsd"/>
+    <xsd:import namespace="http://purl.org/dc/terms/" schemaLocation="http://dublincore.org/schemas/xmls/qdc/2003/04/02/dcterms.xsd"/>
+    <xsd:element name="coreProperties" type="CT_coreProperties"/>
+    <xsd:complexType name="CT_coreProperties">
+      <xsd:all>
+        <xsd:element ref="dc:creator" minOccurs="0" maxOccurs="1"/>
+        <xsd:element ref="dcterms:created" minOccurs="0" maxOccurs="1"/>
+        <xsd:element ref="dc:identifier" minOccurs="0" maxOccurs="1"/>
+        <xsd:element name="contentType" minOccurs="0" maxOccurs="1" type="xsd:string" ma:index="0" ma:displayName="Content Type"/>
+        <xsd:element ref="dc:title" minOccurs="0" maxOccurs="1" ma:index="4" ma:displayName="Title"/>
+        <xsd:element ref="dc:subject" minOccurs="0" maxOccurs="1"/>
+        <xsd:element ref="dc:description" minOccurs="0" maxOccurs="1"/>
+        <xsd:element name="keywords" minOccurs="0" maxOccurs="1" type="xsd:string"/>
+        <xsd:element ref="dc:language" minOccurs="0" maxOccurs="1"/>
+        <xsd:element name="category" minOccurs="0" maxOccurs="1" type="xsd:string"/>
+        <xsd:element name="version" minOccurs="0" maxOccurs="1" type="xsd:string"/>
+        <xsd:element name="revision" minOccurs="0" maxOccurs="1" type="xsd:string">
+          <xsd:annotation>
+            <xsd:documentation>
+                        This value indicates the number of saves or revisions. The application is responsible for updating this value after each revision.
+                    </xsd:documentation>
+          </xsd:annotation>
+        </xsd:element>
+        <xsd:element name="lastModifiedBy" minOccurs="0" maxOccurs="1" type="xsd:string"/>
+        <xsd:element ref="dcterms:modified" minOccurs="0" maxOccurs="1"/>
+        <xsd:element name="contentStatus" minOccurs="0" maxOccurs="1" type="xsd:string"/>
+      </xsd:all>
+    </xsd:complexType>
+  </xsd:schema>
+  <xs:schema xmlns:pc="http://schemas.microsoft.com/office/infopath/2007/PartnerControls" xmlns:xs="http://www.w3.org/2001/XMLSchema" targetNamespace="http://schemas.microsoft.com/office/infopath/2007/PartnerControls" elementFormDefault="qualified" attributeFormDefault="unqualified">
+    <xs:element name="Person">
+      <xs:complexType>
+        <xs:sequence>
+          <xs:element ref="pc:DisplayName" minOccurs="0"/>
+          <xs:element ref="pc:AccountId" minOccurs="0"/>
+          <xs:element ref="pc:AccountType" minOccurs="0"/>
+        </xs:sequence>
+      </xs:complexType>
+    </xs:element>
+    <xs:element name="DisplayName" type="xs:string"/>
+    <xs:element name="AccountId" type="xs:string"/>
+    <xs:element name="AccountType" type="xs:string"/>
+    <xs:element name="BDCAssociatedEntity">
+      <xs:complexType>
+        <xs:sequence>
+          <xs:element ref="pc:BDCEntity" minOccurs="0" maxOccurs="unbounded"/>
+        </xs:sequence>
+        <xs:attribute ref="pc:EntityNamespace"/>
+        <xs:attribute ref="pc:EntityName"/>
+        <xs:attribute ref="pc:SystemInstanceName"/>
+        <xs:attribute ref="pc:AssociationName"/>
+      </xs:complexType>
+    </xs:element>
+    <xs:attribute name="EntityNamespace" type="xs:string"/>
+    <xs:attribute name="EntityName" type="xs:string"/>
+    <xs:attribute name="SystemInstanceName" type="xs:string"/>
+    <xs:attribute name="AssociationName" type="xs:string"/>
+    <xs:element name="BDCEntity">
+      <xs:complexType>
+        <xs:sequence>
+          <xs:element ref="pc:EntityDisplayName" minOccurs="0"/>
+          <xs:element ref="pc:EntityInstanceReference" minOccurs="0"/>
+          <xs:element ref="pc:EntityId1" minOccurs="0"/>
+          <xs:element ref="pc:EntityId2" minOccurs="0"/>
+          <xs:element ref="pc:EntityId3" minOccurs="0"/>
+          <xs:element ref="pc:EntityId4" minOccurs="0"/>
+          <xs:element ref="pc:EntityId5" minOccurs="0"/>
+        </xs:sequence>
+      </xs:complexType>
+    </xs:element>
+    <xs:element name="EntityDisplayName" type="xs:string"/>
+    <xs:element name="EntityInstanceReference" type="xs:string"/>
+    <xs:element name="EntityId1" type="xs:string"/>
+    <xs:element name="EntityId2" type="xs:string"/>
+    <xs:element name="EntityId3" type="xs:string"/>
+    <xs:element name="EntityId4" type="xs:string"/>
+    <xs:element name="EntityId5" type="xs:string"/>
+    <xs:element name="Terms">
+      <xs:complexType>
+        <xs:sequence>
+          <xs:element ref="pc:TermInfo" minOccurs="0" maxOccurs="unbounded"/>
+        </xs:sequence>
+      </xs:complexType>
+    </xs:element>
+    <xs:element name="TermInfo">
+      <xs:complexType>
+        <xs:sequence>
+          <xs:element ref="pc:TermName" minOccurs="0"/>
+          <xs:element ref="pc:TermId" minOccurs="0"/>
+        </xs:sequence>
+      </xs:complexType>
+    </xs:element>
+    <xs:element name="TermName" type="xs:string"/>
+    <xs:element name="TermId" type="xs:string"/>
+  </xs:schema>
+</ct:contentTypeSchema>
+</file>
+
+<file path=customXml/item2.xml><?xml version="1.0" encoding="utf-8"?>
+<?mso-contentType ?>
+<FormTemplates xmlns="http://schemas.microsoft.com/sharepoint/v3/contenttype/forms">
+  <Display>DocumentLibraryForm</Display>
+  <Edit>DocumentLibraryForm</Edit>
+  <New>DocumentLibraryForm</New>
+</FormTemplates>
+</file>
+
+<file path=customXml/item3.xml><?xml version="1.0" encoding="utf-8"?>
+<p:properties xmlns:p="http://schemas.microsoft.com/office/2006/metadata/properties" xmlns:xsi="http://www.w3.org/2001/XMLSchema-instance" xmlns:pc="http://schemas.microsoft.com/office/infopath/2007/PartnerControls">
+  <documentManagement/>
+</p:properties>
+</file>
+
+<file path=customXml/itemProps1.xml><?xml version="1.0" encoding="utf-8"?>
+<ds:datastoreItem xmlns:ds="http://schemas.openxmlformats.org/officeDocument/2006/customXml" ds:itemID="{D1463D52-5E3A-4F41-9F2D-37A66D81B10F}">
+  <ds:schemaRefs>
+    <ds:schemaRef ds:uri="http://schemas.microsoft.com/office/2006/metadata/contentType"/>
+    <ds:schemaRef ds:uri="http://schemas.microsoft.com/office/2006/metadata/properties/metaAttributes"/>
+    <ds:schemaRef ds:uri="http://www.w3.org/2001/XMLSchema"/>
+    <ds:schemaRef ds:uri="http://schemas.microsoft.com/office/2006/metadata/properties"/>
+    <ds:schemaRef ds:uri="22d73a51-a696-4308-afbc-2b8a91add569"/>
+    <ds:schemaRef ds:uri="http://schemas.microsoft.com/office/2006/documentManagement/types"/>
+    <ds:schemaRef ds:uri="http://schemas.microsoft.com/office/infopath/2007/PartnerControls"/>
+    <ds:schemaRef ds:uri="http://schemas.openxmlformats.org/package/2006/metadata/core-properties"/>
+    <ds:schemaRef ds:uri="http://purl.org/dc/elements/1.1/"/>
+    <ds:schemaRef ds:uri="http://purl.org/dc/terms/"/>
+    <ds:schemaRef ds:uri="http://schemas.microsoft.com/internal/obd"/>
+  </ds:schemaRefs>
+</ds:datastoreItem>
+</file>
+
+<file path=customXml/itemProps2.xml><?xml version="1.0" encoding="utf-8"?>
+<ds:datastoreItem xmlns:ds="http://schemas.openxmlformats.org/officeDocument/2006/customXml" ds:itemID="{58EBC2D4-A96F-496E-ADB4-CD16887C4178}">
+  <ds:schemaRefs>
+    <ds:schemaRef ds:uri="http://schemas.microsoft.com/sharepoint/v3/contenttype/forms"/>
+  </ds:schemaRefs>
+</ds:datastoreItem>
+</file>
+
+<file path=customXml/itemProps3.xml><?xml version="1.0" encoding="utf-8"?>
+<ds:datastoreItem xmlns:ds="http://schemas.openxmlformats.org/officeDocument/2006/customXml" ds:itemID="{78F8F88E-241A-4286-8CF8-FEEF0EBB47D8}">
+  <ds:schemaRefs>
+    <ds:schemaRef ds:uri="http://schemas.microsoft.com/office/2006/documentManagement/types"/>
+    <ds:schemaRef ds:uri="http://purl.org/dc/terms/"/>
+    <ds:schemaRef ds:uri="http://www.w3.org/XML/1998/namespace"/>
+    <ds:schemaRef ds:uri="http://schemas.microsoft.com/office/2006/metadata/properties"/>
+    <ds:schemaRef ds:uri="http://schemas.openxmlformats.org/package/2006/metadata/core-properties"/>
+    <ds:schemaRef ds:uri="http://purl.org/dc/dcmitype/"/>
+    <ds:schemaRef ds:uri="http://schemas.microsoft.com/office/infopath/2007/PartnerControls"/>
+    <ds:schemaRef ds:uri="22d73a51-a696-4308-afbc-2b8a91add569"/>
+    <ds:schemaRef ds:uri="http://purl.org/dc/elements/1.1/"/>
+  </ds:schemaRefs>
+</ds:datastoreItem>
 </file>
</xml_diff>